<commit_message>
Fix form generation merge fields
</commit_message>
<xml_diff>
--- a/templates/Application for Protection Order.docx
+++ b/templates/Application for Protection Order.docx
@@ -1085,6 +1085,7 @@
           <w:rFonts w:ascii="Arial" w:hAnsi="Arial" w:cs="Arial"/>
           <w:lang w:val="en-GB"/>
         </w:rPr>
+        <w:br w:type="page"/>
         <w:t>I,</w:t>
       </w:r>
       <w:r>
@@ -1366,6 +1367,9 @@
         <w:t>Affidavit in Support </w:t>
       </w:r>
       <w:r>
+        <w:br/>
+      </w:r>
+      <w:r>
         <w:rPr>
           <w:rStyle w:val="eop"/>
           <w:rFonts w:ascii="Arial" w:hAnsi="Arial" w:cs="Arial"/>
@@ -1983,6 +1987,7 @@
           <w:bCs/>
           <w:lang w:val="en-GB"/>
         </w:rPr>
+        <w:br w:type="page"/>
         <w:t>CERTIFICATE OF LAWYER</w:t>
       </w:r>
       <w:r>
@@ -2894,6 +2899,7 @@
           <w:bCs/>
           <w:lang w:val="en-GB"/>
         </w:rPr>
+        <w:br w:type="page"/>
         <w:t>DATE OF HEARING</w:t>
       </w:r>
       <w:r>

</xml_diff>